<commit_message>
Solve test_list + dichotomous issue
</commit_message>
<xml_diff>
--- a/minutes.docx
+++ b/minutes.docx
@@ -184,7 +184,20 @@
         <w:rPr>
           <w:lang w:val="en-US"/>
         </w:rPr>
-        <w:t xml:space="preserve">- Error with test list </w:t>
+        <w:t xml:space="preserve">- </w:t>
+      </w:r>
+      <w:r>
+        <w:rPr>
+          <w:highlight w:val="yellow"/>
+          <w:lang w:val="en-US"/>
+        </w:rPr>
+        <w:t>Error with test list</w:t>
+      </w:r>
+      <w:r>
+        <w:rPr>
+          <w:lang w:val="en-US"/>
+        </w:rPr>
+        <w:t xml:space="preserve"> </w:t>
       </w:r>
     </w:p>
     <w:p>
@@ -237,6 +250,75 @@
         </w:rPr>
         <w:t>- Check that all combinations work</w:t>
       </w:r>
+    </w:p>
+    <w:p>
+      <w:pPr>
+        <w:rPr>
+          <w:lang w:val="en-US"/>
+        </w:rPr>
+      </w:pPr>
+    </w:p>
+    <w:p>
+      <w:pPr>
+        <w:rPr>
+          <w:b/>
+          <w:bCs/>
+          <w:lang w:val="en-US"/>
+        </w:rPr>
+      </w:pPr>
+      <w:r>
+        <w:rPr>
+          <w:b/>
+          <w:bCs/>
+          <w:lang w:val="en-US"/>
+        </w:rPr>
+        <w:t xml:space="preserve">11.06.2026 </w:t>
+      </w:r>
+    </w:p>
+    <w:p>
+      <w:pPr>
+        <w:rPr>
+          <w:lang w:val="en-US"/>
+        </w:rPr>
+      </w:pPr>
+      <w:r>
+        <w:rPr>
+          <w:lang w:val="en-US"/>
+        </w:rPr>
+        <w:t xml:space="preserve">Error with test_list + error with dichotomous and data2 are resolved </w:t>
+      </w:r>
+    </w:p>
+    <w:p>
+      <w:pPr>
+        <w:rPr>
+          <w:lang w:val="en-US"/>
+        </w:rPr>
+      </w:pPr>
+    </w:p>
+    <w:p>
+      <w:pPr>
+        <w:pStyle w:val="ListParagraph"/>
+        <w:numPr>
+          <w:ilvl w:val="0"/>
+          <w:numId w:val="2"/>
+        </w:numPr>
+        <w:rPr>
+          <w:lang w:val="en-US"/>
+        </w:rPr>
+      </w:pPr>
+      <w:r>
+        <w:rPr>
+          <w:lang w:val="en-US"/>
+        </w:rPr>
+        <w:t xml:space="preserve">Next goal: make the loops </w:t>
+      </w:r>
+    </w:p>
+    <w:p>
+      <w:pPr>
+        <w:rPr>
+          <w:lang w:val="en-US"/>
+        </w:rPr>
+      </w:pPr>
     </w:p>
     <w:sectPr>
       <w:pgSz w:w="11906" w:h="16838"/>
@@ -251,10 +333,11 @@
 <file path=word/numbering.xml><?xml version="1.0" encoding="utf-8"?>
 <w:numbering xmlns:wpc="http://schemas.microsoft.com/office/word/2010/wordprocessingCanvas" xmlns:cx="http://schemas.microsoft.com/office/drawing/2014/chartex" xmlns:cx1="http://schemas.microsoft.com/office/drawing/2015/9/8/chartex" xmlns:cx2="http://schemas.microsoft.com/office/drawing/2015/10/21/chartex" xmlns:cx3="http://schemas.microsoft.com/office/drawing/2016/5/9/chartex" xmlns:cx4="http://schemas.microsoft.com/office/drawing/2016/5/10/chartex" xmlns:cx5="http://schemas.microsoft.com/office/drawing/2016/5/11/chartex" xmlns:cx6="http://schemas.microsoft.com/office/drawing/2016/5/12/chartex" xmlns:cx7="http://schemas.microsoft.com/office/drawing/2016/5/13/chartex" xmlns:cx8="http://schemas.microsoft.com/office/drawing/2016/5/14/chartex" xmlns:mc="http://schemas.openxmlformats.org/markup-compatibility/2006" xmlns:aink="http://schemas.microsoft.com/office/drawing/2016/ink" xmlns:am3d="http://schemas.microsoft.com/office/drawing/2017/model3d" xmlns:o="urn:schemas-microsoft-com:office:office" xmlns:oel="http://schemas.microsoft.com/office/2019/extlst" xmlns:r="http://schemas.openxmlformats.org/officeDocument/2006/relationships" xmlns:m="http://schemas.openxmlformats.org/officeDocument/2006/math" xmlns:v="urn:schemas-microsoft-com:vml" xmlns:wp14="http://schemas.microsoft.com/office/word/2010/wordprocessingDrawing" xmlns:wp="http://schemas.openxmlformats.org/drawingml/2006/wordprocessingDrawing" xmlns:w10="urn:schemas-microsoft-com:office:word" xmlns:w="http://schemas.openxmlformats.org/wordprocessingml/2006/main" xmlns:w14="http://schemas.microsoft.com/office/word/2010/wordml" xmlns:w15="http://schemas.microsoft.com/office/word/2012/wordml" xmlns:w16cex="http://schemas.microsoft.com/office/word/2018/wordml/cex" xmlns:w16cid="http://schemas.microsoft.com/office/word/2016/wordml/cid" xmlns:w16="http://schemas.microsoft.com/office/word/2018/wordml" xmlns:w16du="http://schemas.microsoft.com/office/word/2023/wordml/word16du" xmlns:w16sdtdh="http://schemas.microsoft.com/office/word/2020/wordml/sdtdatahash" xmlns:w16sdtfl="http://schemas.microsoft.com/office/word/2024/wordml/sdtformatlock" xmlns:w16se="http://schemas.microsoft.com/office/word/2015/wordml/symex" xmlns:wpg="http://schemas.microsoft.com/office/word/2010/wordprocessingGroup" xmlns:wpi="http://schemas.microsoft.com/office/word/2010/wordprocessingInk" xmlns:wne="http://schemas.microsoft.com/office/word/2006/wordml" xmlns:wps="http://schemas.microsoft.com/office/word/2010/wordprocessingShape" mc:Ignorable="w14 w15 w16se w16cid w16 w16cex w16sdtdh w16sdtfl w16du wp14">
   <w:abstractNum w:abstractNumId="0" w15:restartNumberingAfterBreak="0">
-    <w:nsid w:val="6D510D92"/>
+    <w:nsid w:val="544406EC"/>
     <w:multiLevelType w:val="hybridMultilevel"/>
-    <w:tmpl w:val="B7D04130"/>
-    <w:lvl w:ilvl="0" w:tplc="02FA7C22">
+    <w:tmpl w:val="E9C4B688"/>
+    <w:lvl w:ilvl="0" w:tplc="A580B1C8">
+      <w:start w:val="11"/>
       <w:numFmt w:val="bullet"/>
       <w:lvlText w:val="-"/>
       <w:lvlJc w:val="left"/>
@@ -362,7 +445,122 @@
       </w:rPr>
     </w:lvl>
   </w:abstractNum>
+  <w:abstractNum w:abstractNumId="1" w15:restartNumberingAfterBreak="0">
+    <w:nsid w:val="6D510D92"/>
+    <w:multiLevelType w:val="hybridMultilevel"/>
+    <w:tmpl w:val="B7D04130"/>
+    <w:lvl w:ilvl="0" w:tplc="02FA7C22">
+      <w:numFmt w:val="bullet"/>
+      <w:lvlText w:val="-"/>
+      <w:lvlJc w:val="left"/>
+      <w:pPr>
+        <w:ind w:left="720" w:hanging="360"/>
+      </w:pPr>
+      <w:rPr>
+        <w:rFonts w:ascii="Aptos" w:eastAsiaTheme="minorHAnsi" w:hAnsi="Aptos" w:cstheme="minorBidi" w:hint="default"/>
+      </w:rPr>
+    </w:lvl>
+    <w:lvl w:ilvl="1" w:tplc="08070003" w:tentative="1">
+      <w:start w:val="1"/>
+      <w:numFmt w:val="bullet"/>
+      <w:lvlText w:val="o"/>
+      <w:lvlJc w:val="left"/>
+      <w:pPr>
+        <w:ind w:left="1440" w:hanging="360"/>
+      </w:pPr>
+      <w:rPr>
+        <w:rFonts w:ascii="Courier New" w:hAnsi="Courier New" w:cs="Courier New" w:hint="default"/>
+      </w:rPr>
+    </w:lvl>
+    <w:lvl w:ilvl="2" w:tplc="08070005" w:tentative="1">
+      <w:start w:val="1"/>
+      <w:numFmt w:val="bullet"/>
+      <w:lvlText w:val=""/>
+      <w:lvlJc w:val="left"/>
+      <w:pPr>
+        <w:ind w:left="2160" w:hanging="360"/>
+      </w:pPr>
+      <w:rPr>
+        <w:rFonts w:ascii="Wingdings" w:hAnsi="Wingdings" w:hint="default"/>
+      </w:rPr>
+    </w:lvl>
+    <w:lvl w:ilvl="3" w:tplc="08070001" w:tentative="1">
+      <w:start w:val="1"/>
+      <w:numFmt w:val="bullet"/>
+      <w:lvlText w:val=""/>
+      <w:lvlJc w:val="left"/>
+      <w:pPr>
+        <w:ind w:left="2880" w:hanging="360"/>
+      </w:pPr>
+      <w:rPr>
+        <w:rFonts w:ascii="Symbol" w:hAnsi="Symbol" w:hint="default"/>
+      </w:rPr>
+    </w:lvl>
+    <w:lvl w:ilvl="4" w:tplc="08070003" w:tentative="1">
+      <w:start w:val="1"/>
+      <w:numFmt w:val="bullet"/>
+      <w:lvlText w:val="o"/>
+      <w:lvlJc w:val="left"/>
+      <w:pPr>
+        <w:ind w:left="3600" w:hanging="360"/>
+      </w:pPr>
+      <w:rPr>
+        <w:rFonts w:ascii="Courier New" w:hAnsi="Courier New" w:cs="Courier New" w:hint="default"/>
+      </w:rPr>
+    </w:lvl>
+    <w:lvl w:ilvl="5" w:tplc="08070005" w:tentative="1">
+      <w:start w:val="1"/>
+      <w:numFmt w:val="bullet"/>
+      <w:lvlText w:val=""/>
+      <w:lvlJc w:val="left"/>
+      <w:pPr>
+        <w:ind w:left="4320" w:hanging="360"/>
+      </w:pPr>
+      <w:rPr>
+        <w:rFonts w:ascii="Wingdings" w:hAnsi="Wingdings" w:hint="default"/>
+      </w:rPr>
+    </w:lvl>
+    <w:lvl w:ilvl="6" w:tplc="08070001" w:tentative="1">
+      <w:start w:val="1"/>
+      <w:numFmt w:val="bullet"/>
+      <w:lvlText w:val=""/>
+      <w:lvlJc w:val="left"/>
+      <w:pPr>
+        <w:ind w:left="5040" w:hanging="360"/>
+      </w:pPr>
+      <w:rPr>
+        <w:rFonts w:ascii="Symbol" w:hAnsi="Symbol" w:hint="default"/>
+      </w:rPr>
+    </w:lvl>
+    <w:lvl w:ilvl="7" w:tplc="08070003" w:tentative="1">
+      <w:start w:val="1"/>
+      <w:numFmt w:val="bullet"/>
+      <w:lvlText w:val="o"/>
+      <w:lvlJc w:val="left"/>
+      <w:pPr>
+        <w:ind w:left="5760" w:hanging="360"/>
+      </w:pPr>
+      <w:rPr>
+        <w:rFonts w:ascii="Courier New" w:hAnsi="Courier New" w:cs="Courier New" w:hint="default"/>
+      </w:rPr>
+    </w:lvl>
+    <w:lvl w:ilvl="8" w:tplc="08070005" w:tentative="1">
+      <w:start w:val="1"/>
+      <w:numFmt w:val="bullet"/>
+      <w:lvlText w:val=""/>
+      <w:lvlJc w:val="left"/>
+      <w:pPr>
+        <w:ind w:left="6480" w:hanging="360"/>
+      </w:pPr>
+      <w:rPr>
+        <w:rFonts w:ascii="Wingdings" w:hAnsi="Wingdings" w:hint="default"/>
+      </w:rPr>
+    </w:lvl>
+  </w:abstractNum>
   <w:num w:numId="1" w16cid:durableId="1175999096">
+    <w:abstractNumId w:val="1"/>
+  </w:num>
+  <w:num w:numId="2" w16cid:durableId="29916053">
     <w:abstractNumId w:val="0"/>
   </w:num>
 </w:numbering>

</xml_diff>

<commit_message>
finished. need to clean and test
</commit_message>
<xml_diff>
--- a/minutes.docx
+++ b/minutes.docx
@@ -625,6 +625,26 @@
     </w:p>
     <w:p>
       <w:pPr>
+        <w:rPr>
+          <w:lang w:val="en-US"/>
+        </w:rPr>
+      </w:pPr>
+    </w:p>
+    <w:p>
+      <w:pPr>
+        <w:rPr>
+          <w:lang w:val="en-US"/>
+        </w:rPr>
+      </w:pPr>
+      <w:r>
+        <w:rPr>
+          <w:lang w:val="en-US"/>
+        </w:rPr>
+        <w:t xml:space="preserve">Note: overall does not require its own loop. </w:t>
+      </w:r>
+    </w:p>
+    <w:p>
+      <w:pPr>
         <w:pStyle w:val="ListParagraph"/>
         <w:numPr>
           <w:ilvl w:val="0"/>
@@ -662,6 +682,19 @@
         </w:rPr>
         <w:t>Tbl_return &lt;- merge(tbl_nomissing_default, tbl_missing_percent)</w:t>
       </w:r>
+      <w:r>
+        <w:rPr>
+          <w:lang w:val="en-US"/>
+        </w:rPr>
+        <w:t xml:space="preserve"> </w:t>
+      </w:r>
+      <w:r>
+        <w:rPr>
+          <w:highlight w:val="yellow"/>
+          <w:lang w:val="en-US"/>
+        </w:rPr>
+        <w:t>OK</w:t>
+      </w:r>
     </w:p>
     <w:p>
       <w:pPr>
@@ -684,6 +717,21 @@
         </w:rPr>
         <w:t>If(Missing_percent == “FALSE” | missing = “FALSE” )</w:t>
       </w:r>
+      <w:r>
+        <w:rPr>
+          <w:b/>
+          <w:bCs/>
+          <w:lang w:val="en-US"/>
+        </w:rPr>
+        <w:t xml:space="preserve"> </w:t>
+      </w:r>
+      <w:r>
+        <w:rPr>
+          <w:highlight w:val="yellow"/>
+          <w:lang w:val="en-US"/>
+        </w:rPr>
+        <w:t>OK</w:t>
+      </w:r>
     </w:p>
     <w:p>
       <w:pPr>
@@ -702,6 +750,12 @@
         </w:rPr>
         <w:t>tbl_return -&gt; tbl_nomissing_default (they do have ci and add_n but not overall)</w:t>
       </w:r>
+      <w:r>
+        <w:rPr>
+          <w:lang w:val="en-US"/>
+        </w:rPr>
+        <w:t xml:space="preserve"> </w:t>
+      </w:r>
     </w:p>
     <w:p>
       <w:pPr>
@@ -724,6 +778,21 @@
         </w:rPr>
         <w:t xml:space="preserve">If(Missing_percent == “TRUE”) </w:t>
       </w:r>
+      <w:r>
+        <w:rPr>
+          <w:b/>
+          <w:bCs/>
+          <w:lang w:val="en-US"/>
+        </w:rPr>
+        <w:t xml:space="preserve"> </w:t>
+      </w:r>
+      <w:r>
+        <w:rPr>
+          <w:highlight w:val="yellow"/>
+          <w:lang w:val="en-US"/>
+        </w:rPr>
+        <w:t>OK</w:t>
+      </w:r>
     </w:p>
     <w:p>
       <w:pPr>
@@ -782,6 +851,12 @@
         </w:rPr>
         <w:t>Tbl_return &lt;- merge(tbl_return, tbl_nomissing_short)</w:t>
       </w:r>
+      <w:r>
+        <w:rPr>
+          <w:lang w:val="en-US"/>
+        </w:rPr>
+        <w:t xml:space="preserve"> </w:t>
+      </w:r>
     </w:p>
     <w:p>
       <w:pPr>
@@ -802,7 +877,7 @@
           <w:bCs/>
           <w:lang w:val="en-US"/>
         </w:rPr>
-        <w:t xml:space="preserve">If (add_n = FALSE) </w:t>
+        <w:t xml:space="preserve">If(Ci = FALSE) </w:t>
       </w:r>
     </w:p>
     <w:p>
@@ -820,7 +895,15 @@
         <w:rPr>
           <w:lang w:val="en-US"/>
         </w:rPr>
-        <w:t>Tbl_return &lt;- tbl_return – add_n</w:t>
+        <w:lastRenderedPageBreak/>
+        <w:t xml:space="preserve">Tbl_return &lt;- tbl_return – ci </w:t>
+      </w:r>
+      <w:r>
+        <w:rPr>
+          <w:highlight w:val="yellow"/>
+          <w:lang w:val="en-US"/>
+        </w:rPr>
+        <w:t>OK</w:t>
       </w:r>
     </w:p>
     <w:p>
@@ -842,7 +925,7 @@
           <w:bCs/>
           <w:lang w:val="en-US"/>
         </w:rPr>
-        <w:t xml:space="preserve">If(Ci = FALSE) </w:t>
+        <w:t xml:space="preserve">If (add_n = FALSE) </w:t>
       </w:r>
     </w:p>
     <w:p>
@@ -860,20 +943,26 @@
         <w:rPr>
           <w:lang w:val="en-US"/>
         </w:rPr>
-        <w:t xml:space="preserve">Tbl_return &lt;- tbl_return – ci </w:t>
-      </w:r>
-    </w:p>
-    <w:p>
-      <w:pPr>
-        <w:rPr>
-          <w:lang w:val="en-US"/>
-        </w:rPr>
-      </w:pPr>
-      <w:r>
-        <w:rPr>
-          <w:lang w:val="en-US"/>
-        </w:rPr>
-        <w:lastRenderedPageBreak/>
+        <w:t>Tbl_return &lt;- tbl_return – add_n</w:t>
+      </w:r>
+    </w:p>
+    <w:p>
+      <w:pPr>
+        <w:rPr>
+          <w:lang w:val="en-US"/>
+        </w:rPr>
+      </w:pPr>
+    </w:p>
+    <w:p>
+      <w:pPr>
+        <w:rPr>
+          <w:lang w:val="en-US"/>
+        </w:rPr>
+      </w:pPr>
+      <w:r>
+        <w:rPr>
+          <w:lang w:val="en-US"/>
+        </w:rPr>
         <w:t>Important: polish the headers (look at example with tbl_both)</w:t>
       </w:r>
     </w:p>
@@ -932,7 +1021,47 @@
     </w:p>
     <w:p>
       <w:pPr>
-        <w:ind w:left="1080"/>
+        <w:rPr>
+          <w:lang w:val="en-US"/>
+        </w:rPr>
+      </w:pPr>
+    </w:p>
+    <w:p>
+      <w:pPr>
+        <w:rPr>
+          <w:lang w:val="en-US"/>
+        </w:rPr>
+      </w:pPr>
+    </w:p>
+    <w:p>
+      <w:pPr>
+        <w:rPr>
+          <w:lang w:val="en-US"/>
+        </w:rPr>
+      </w:pPr>
+    </w:p>
+    <w:p>
+      <w:pPr>
+        <w:rPr>
+          <w:lang w:val="en-US"/>
+        </w:rPr>
+      </w:pPr>
+    </w:p>
+    <w:p>
+      <w:pPr>
+        <w:rPr>
+          <w:lang w:val="en-US"/>
+        </w:rPr>
+      </w:pPr>
+      <w:r>
+        <w:rPr>
+          <w:lang w:val="en-US"/>
+        </w:rPr>
+        <w:t>Last steps:</w:t>
+      </w:r>
+    </w:p>
+    <w:p>
+      <w:pPr>
         <w:rPr>
           <w:lang w:val="en-US"/>
         </w:rPr>
@@ -946,20 +1075,121 @@
           <w:numId w:val="2"/>
         </w:numPr>
         <w:rPr>
-          <w:lang w:val="en-US"/>
-        </w:rPr>
-      </w:pPr>
-      <w:r>
-        <w:rPr>
-          <w:lang w:val="en-US"/>
-        </w:rPr>
-        <w:t xml:space="preserve">Tbl_return is </w:t>
-      </w:r>
-      <w:r>
-        <w:rPr>
-          <w:lang w:val="en-US"/>
-        </w:rPr>
-        <w:t xml:space="preserve">Tbl_noMissing_default or tbl_nomissing_short </w:t>
+          <w:b/>
+          <w:bCs/>
+          <w:lang w:val="en-US"/>
+        </w:rPr>
+      </w:pPr>
+      <w:r>
+        <w:rPr>
+          <w:b/>
+          <w:bCs/>
+          <w:lang w:val="en-US"/>
+        </w:rPr>
+        <w:t xml:space="preserve">Warning messages in general </w:t>
+      </w:r>
+    </w:p>
+    <w:p>
+      <w:pPr>
+        <w:pStyle w:val="ListParagraph"/>
+        <w:numPr>
+          <w:ilvl w:val="1"/>
+          <w:numId w:val="2"/>
+        </w:numPr>
+        <w:rPr>
+          <w:lang w:val="en-US"/>
+        </w:rPr>
+      </w:pPr>
+      <w:r>
+        <w:rPr>
+          <w:lang w:val="en-US"/>
+        </w:rPr>
+        <w:t xml:space="preserve">Warnmeldung: Using an external vector in selections was deprecated in tidyselect 1.1.0. </w:t>
+      </w:r>
+      <w:r>
+        <w:rPr>
+          <w:rFonts w:ascii="Cambria Math" w:hAnsi="Cambria Math" w:cs="Cambria Math"/>
+          <w:lang w:val="en-US"/>
+        </w:rPr>
+        <w:t>ℹ</w:t>
+      </w:r>
+      <w:r>
+        <w:rPr>
+          <w:lang w:val="en-US"/>
+        </w:rPr>
+        <w:t xml:space="preserve"> Please use `all_of()` or `any_of()` instead. # Was: data %&gt;% select(group) # Now: data %&gt;% select(all_of(group))</w:t>
+      </w:r>
+    </w:p>
+    <w:p>
+      <w:pPr>
+        <w:pStyle w:val="ListParagraph"/>
+        <w:numPr>
+          <w:ilvl w:val="0"/>
+          <w:numId w:val="2"/>
+        </w:numPr>
+        <w:rPr>
+          <w:lang w:val="en-US"/>
+        </w:rPr>
+      </w:pPr>
+      <w:r>
+        <w:rPr>
+          <w:lang w:val="en-US"/>
+        </w:rPr>
+        <w:t xml:space="preserve">Remove the confidence interval for missing ? Maybe as a bug fix or ask the team before. </w:t>
+      </w:r>
+    </w:p>
+    <w:p>
+      <w:pPr>
+        <w:pStyle w:val="ListParagraph"/>
+        <w:numPr>
+          <w:ilvl w:val="0"/>
+          <w:numId w:val="2"/>
+        </w:numPr>
+        <w:rPr>
+          <w:lang w:val="en-US"/>
+        </w:rPr>
+      </w:pPr>
+      <w:r>
+        <w:rPr>
+          <w:lang w:val="en-US"/>
+        </w:rPr>
+        <w:t xml:space="preserve">Clean code </w:t>
+      </w:r>
+    </w:p>
+    <w:p>
+      <w:pPr>
+        <w:pStyle w:val="ListParagraph"/>
+        <w:numPr>
+          <w:ilvl w:val="0"/>
+          <w:numId w:val="2"/>
+        </w:numPr>
+        <w:rPr>
+          <w:lang w:val="en-US"/>
+        </w:rPr>
+      </w:pPr>
+      <w:r>
+        <w:rPr>
+          <w:lang w:val="en-US"/>
+        </w:rPr>
+        <w:t xml:space="preserve">Not run the run which is not needed </w:t>
+      </w:r>
+    </w:p>
+    <w:p>
+      <w:pPr>
+        <w:pStyle w:val="ListParagraph"/>
+        <w:numPr>
+          <w:ilvl w:val="0"/>
+          <w:numId w:val="2"/>
+        </w:numPr>
+        <w:rPr>
+          <w:lang w:val="en-US"/>
+        </w:rPr>
+      </w:pPr>
+      <w:r>
+        <w:rPr>
+          <w:lang w:val="en-US"/>
+        </w:rPr>
+        <w:t xml:space="preserve">Test, test, test </w:t>
       </w:r>
     </w:p>
     <w:sectPr>
@@ -1153,6 +1383,95 @@
     </w:lvl>
   </w:abstractNum>
   <w:abstractNum w:abstractNumId="2" w15:restartNumberingAfterBreak="0">
+    <w:nsid w:val="4517523D"/>
+    <w:multiLevelType w:val="hybridMultilevel"/>
+    <w:tmpl w:val="00A640FC"/>
+    <w:lvl w:ilvl="0" w:tplc="FFFFFFFF">
+      <w:start w:val="1"/>
+      <w:numFmt w:val="decimal"/>
+      <w:lvlText w:val="%1."/>
+      <w:lvlJc w:val="left"/>
+      <w:pPr>
+        <w:ind w:left="1080" w:hanging="360"/>
+      </w:pPr>
+      <w:rPr>
+        <w:rFonts w:hint="default"/>
+      </w:rPr>
+    </w:lvl>
+    <w:lvl w:ilvl="1" w:tplc="FFFFFFFF">
+      <w:start w:val="1"/>
+      <w:numFmt w:val="lowerLetter"/>
+      <w:lvlText w:val="%2."/>
+      <w:lvlJc w:val="left"/>
+      <w:pPr>
+        <w:ind w:left="1440" w:hanging="360"/>
+      </w:pPr>
+    </w:lvl>
+    <w:lvl w:ilvl="2" w:tplc="FFFFFFFF" w:tentative="1">
+      <w:start w:val="1"/>
+      <w:numFmt w:val="lowerRoman"/>
+      <w:lvlText w:val="%3."/>
+      <w:lvlJc w:val="right"/>
+      <w:pPr>
+        <w:ind w:left="2160" w:hanging="180"/>
+      </w:pPr>
+    </w:lvl>
+    <w:lvl w:ilvl="3" w:tplc="FFFFFFFF" w:tentative="1">
+      <w:start w:val="1"/>
+      <w:numFmt w:val="decimal"/>
+      <w:lvlText w:val="%4."/>
+      <w:lvlJc w:val="left"/>
+      <w:pPr>
+        <w:ind w:left="2880" w:hanging="360"/>
+      </w:pPr>
+    </w:lvl>
+    <w:lvl w:ilvl="4" w:tplc="FFFFFFFF" w:tentative="1">
+      <w:start w:val="1"/>
+      <w:numFmt w:val="lowerLetter"/>
+      <w:lvlText w:val="%5."/>
+      <w:lvlJc w:val="left"/>
+      <w:pPr>
+        <w:ind w:left="3600" w:hanging="360"/>
+      </w:pPr>
+    </w:lvl>
+    <w:lvl w:ilvl="5" w:tplc="FFFFFFFF" w:tentative="1">
+      <w:start w:val="1"/>
+      <w:numFmt w:val="lowerRoman"/>
+      <w:lvlText w:val="%6."/>
+      <w:lvlJc w:val="right"/>
+      <w:pPr>
+        <w:ind w:left="4320" w:hanging="180"/>
+      </w:pPr>
+    </w:lvl>
+    <w:lvl w:ilvl="6" w:tplc="FFFFFFFF" w:tentative="1">
+      <w:start w:val="1"/>
+      <w:numFmt w:val="decimal"/>
+      <w:lvlText w:val="%7."/>
+      <w:lvlJc w:val="left"/>
+      <w:pPr>
+        <w:ind w:left="5040" w:hanging="360"/>
+      </w:pPr>
+    </w:lvl>
+    <w:lvl w:ilvl="7" w:tplc="FFFFFFFF" w:tentative="1">
+      <w:start w:val="1"/>
+      <w:numFmt w:val="lowerLetter"/>
+      <w:lvlText w:val="%8."/>
+      <w:lvlJc w:val="left"/>
+      <w:pPr>
+        <w:ind w:left="5760" w:hanging="360"/>
+      </w:pPr>
+    </w:lvl>
+    <w:lvl w:ilvl="8" w:tplc="FFFFFFFF" w:tentative="1">
+      <w:start w:val="1"/>
+      <w:numFmt w:val="lowerRoman"/>
+      <w:lvlText w:val="%9."/>
+      <w:lvlJc w:val="right"/>
+      <w:pPr>
+        <w:ind w:left="6480" w:hanging="180"/>
+      </w:pPr>
+    </w:lvl>
+  </w:abstractNum>
+  <w:abstractNum w:abstractNumId="3" w15:restartNumberingAfterBreak="0">
     <w:nsid w:val="544406EC"/>
     <w:multiLevelType w:val="hybridMultilevel"/>
     <w:tmpl w:val="E9C4B688"/>
@@ -1265,7 +1584,7 @@
       </w:rPr>
     </w:lvl>
   </w:abstractNum>
-  <w:abstractNum w:abstractNumId="3" w15:restartNumberingAfterBreak="0">
+  <w:abstractNum w:abstractNumId="4" w15:restartNumberingAfterBreak="0">
     <w:nsid w:val="6D510D92"/>
     <w:multiLevelType w:val="hybridMultilevel"/>
     <w:tmpl w:val="B7D04130"/>
@@ -1378,16 +1697,19 @@
     </w:lvl>
   </w:abstractNum>
   <w:num w:numId="1" w16cid:durableId="1175999096">
-    <w:abstractNumId w:val="3"/>
+    <w:abstractNumId w:val="4"/>
   </w:num>
   <w:num w:numId="2" w16cid:durableId="29916053">
-    <w:abstractNumId w:val="2"/>
+    <w:abstractNumId w:val="3"/>
   </w:num>
   <w:num w:numId="3" w16cid:durableId="285309325">
     <w:abstractNumId w:val="0"/>
   </w:num>
   <w:num w:numId="4" w16cid:durableId="280460594">
     <w:abstractNumId w:val="1"/>
+  </w:num>
+  <w:num w:numId="5" w16cid:durableId="1131172273">
+    <w:abstractNumId w:val="2"/>
   </w:num>
 </w:numbering>
 </file>
@@ -1995,7 +2317,6 @@
   <w:style w:type="character" w:default="1" w:styleId="DefaultParagraphFont">
     <w:name w:val="Default Paragraph Font"/>
     <w:uiPriority w:val="1"/>
-    <w:semiHidden/>
     <w:unhideWhenUsed/>
   </w:style>
   <w:style w:type="table" w:default="1" w:styleId="TableNormal">

</xml_diff>